<commit_message>
New page copy PL/EN (stories, authors, library, podcasts, submit) + aligned meta descriptions
</commit_message>
<xml_diff>
--- a/MSR_Stan_Projektu_v2026-06-12_MASTER.docx
+++ b/MSR_Stan_Projektu_v2026-06-12_MASTER.docx
@@ -173,6 +173,26 @@
       </w:r>
       <w:r>
         <w:t xml:space="preserve">public/images/news/{erg-chebbi-out-now, podcasts-series-live, magic-library-open}.jpg (1500×1000, PIL): okładka kwadratowa → rozmyte tło + ostry kwadrat w centrum; hero 16:9 → center-crop; ścieżki podmienione w news.ts (TODO usunięte). Treść newsów EN/PL bez zmian — ew. korekta słowna po stronie Dave’a.</w:t>
+      </w:r>
+    </w:p>
+    <w:p>
+      <w:pPr>
+        <w:pStyle w:val="ListParagraph"/>
+        <w:numPr>
+          <w:ilvl w:val="0"/>
+          <w:numId w:val="2"/>
+        </w:numPr>
+        <w:spacing w:after="80"/>
+      </w:pPr>
+      <w:r>
+        <w:rPr>
+          <w:b/>
+          <w:bCs/>
+        </w:rPr>
+        <w:t xml:space="preserve">Nowe opisy stron (copy od Dave’a): </w:t>
+      </w:r>
+      <w:r>
+        <w:t xml:space="preserve">leady stron stories, authors, library, podcasts, submit podmienione w messages/pl.json (teksty Dave’a 1:1) i en.json (przekład Claude’a); meta descriptions (SEO) dopasowane do nowych treści w obu językach. Tytuły: "Każda melodia otwiera nowy rozdział." (stories), "Każdy artysta pisze własny rozdział." (authors); pozostałe bez zmian. Kierunek brzmienia: electronic, organic, deep i melodic house.</w:t>
       </w:r>
     </w:p>
     <w:p>

</xml_diff>

<commit_message>
Share to Stories: site fonts on canvas, smaller type, longer story text
</commit_message>
<xml_diff>
--- a/MSR_Stan_Projektu_v2026-06-12_MASTER.docx
+++ b/MSR_Stan_Projektu_v2026-06-12_MASTER.docx
@@ -193,6 +193,106 @@
       </w:r>
       <w:r>
         <w:t xml:space="preserve">leady stron stories, authors, library, podcasts, submit podmienione w messages/pl.json (teksty Dave’a 1:1) i en.json (przekład Claude’a); meta descriptions (SEO) dopasowane do nowych treści w obu językach. Tytuły: "Każda melodia otwiera nowy rozdział." (stories), "Każdy artysta pisze własny rozdział." (authors); pozostałe bez zmian. Kierunek brzmienia: electronic, organic, deep i melodic house.</w:t>
+      </w:r>
+    </w:p>
+    <w:p>
+      <w:pPr>
+        <w:pStyle w:val="ListParagraph"/>
+        <w:numPr>
+          <w:ilvl w:val="0"/>
+          <w:numId w:val="2"/>
+        </w:numPr>
+        <w:spacing w:after="80"/>
+      </w:pPr>
+      <w:r>
+        <w:rPr>
+          <w:b/>
+          <w:bCs/>
+        </w:rPr>
+        <w:t xml:space="preserve">4 nowe newsy + sprzątanie: </w:t>
+      </w:r>
+      <w:r>
+        <w:t xml:space="preserve">kolory-szczecin-2026 (event 27.06, Zielone Patio Szczecin, link evently.pl), rafael-white-city (28.07, Ame Records, link /authors#rafael), peres-endless-again (22.06, NURAO Records, link /authors#peres), msr-website-live (link /library). Wszystkie EN+PL, bez myślników, cudzysłowy typograficzne. 3 newsy testowe USUNIĘTE (wpisy + grafiki). Grafiki 3:2 wygenerowane z plików od Dave'a; folder news-inbox/ (w .gitignore) = strefa zrzutu surowych grafik do obróbki.</w:t>
+      </w:r>
+    </w:p>
+    <w:p>
+      <w:pPr>
+        <w:pStyle w:val="ListParagraph"/>
+        <w:numPr>
+          <w:ilvl w:val="0"/>
+          <w:numId w:val="2"/>
+        </w:numPr>
+        <w:spacing w:after="80"/>
+      </w:pPr>
+      <w:r>
+        <w:rPr>
+          <w:b/>
+          <w:bCs/>
+        </w:rPr>
+        <w:t xml:space="preserve">Karuzela News szersza: </w:t>
+      </w:r>
+      <w:r>
+        <w:t xml:space="preserve">kontener max-w-3xl → max-w-5xl (NewsSection); panel obrazu na md+: h-full z rozmytą kopią grafiki w tle (blur-2xl, brightness .55) i ostrą wersją object-contain — pełna grafika widoczna, brak pustej przestrzeni przy długim tekście. Mobile bez zmian (aspect 3:2).</w:t>
+      </w:r>
+    </w:p>
+    <w:p>
+      <w:pPr>
+        <w:pStyle w:val="ListParagraph"/>
+        <w:numPr>
+          <w:ilvl w:val="0"/>
+          <w:numId w:val="2"/>
+        </w:numPr>
+        <w:spacing w:after="80"/>
+      </w:pPr>
+      <w:r>
+        <w:rPr>
+          <w:b/>
+          <w:bCs/>
+        </w:rPr>
+        <w:t xml:space="preserve">Share to Stories — reguła krótkiego tekstu: </w:t>
+      </w:r>
+      <w:r>
+        <w:t xml:space="preserve">nowe pola story/storyPl w news.ts (1-2 zdania pod IG Stories) — wszystkie 4 newsy je mają; generator bierze story zamiast blurba. Fallback fitLines() w ShareStory.tsx: skraca do pełnych zdań mieszczących się w limicie linii, ostatecznie tnie na granicy słowa z wielokropkiem. REGUŁA: każdy nowy news dostaje story+storyPl.</w:t>
+      </w:r>
+    </w:p>
+    <w:p>
+      <w:pPr>
+        <w:pStyle w:val="ListParagraph"/>
+        <w:numPr>
+          <w:ilvl w:val="0"/>
+          <w:numId w:val="2"/>
+        </w:numPr>
+        <w:spacing w:after="80"/>
+      </w:pPr>
+      <w:r>
+        <w:rPr>
+          <w:b/>
+          <w:bCs/>
+        </w:rPr>
+        <w:t xml:space="preserve">Supabase + Google OAuth (przez Chrome): </w:t>
+      </w:r>
+      <w:r>
+        <w:t xml:space="preserve">Site URL → https://magic-stories-three.vercel.app, Redirect URLs: produkcja/** + localhost:3000/** (fix logowania mobilnego WYKONANY). Snippet "Promote User to Artist (Role Badge)" zapisany w SQL Editorze. Google OAuth OPUBLIKOWANY (In production) — loguje się każdy. Procedura: Rafa'el → /pl/account → logowanie Google → snippet SQL z jego username.</w:t>
+      </w:r>
+    </w:p>
+    <w:p>
+      <w:pPr>
+        <w:pStyle w:val="ListParagraph"/>
+        <w:numPr>
+          <w:ilvl w:val="0"/>
+          <w:numId w:val="2"/>
+        </w:numPr>
+        <w:spacing w:after="80"/>
+      </w:pPr>
+      <w:r>
+        <w:rPr>
+          <w:b/>
+          <w:bCs/>
+        </w:rPr>
+        <w:t xml:space="preserve">Drobiazgi UI/copy: </w:t>
+      </w:r>
+      <w:r>
+        <w:t xml:space="preserve">tytuły zakładek z separatorem | zamiast myślnika (12 szt.); Podcasty: "Każdy mix to nowy rozdział."; nav: /account dodany do darkPages (ciemny pasek); nagłówek sekcji News po angielsku też w PL ("News / Fresh from the label." — decyzja Dave'a, jak Hero).</w:t>
       </w:r>
     </w:p>
     <w:p>
@@ -4283,7 +4383,7 @@
         <w:spacing w:after="120"/>
       </w:pPr>
       <w:r>
-        <w:t xml:space="preserve">Treść: statyczna w src/data/news.ts — pola { slug, date, title, titlePl, blurb, blurbPl, image?, link?, cta?, ctaPl? }. slug to stałe ID engagementu — NIE zmieniać. Strona główna podstawia wersję PL przed przekazaniem do karuzeli. Obecnie 3 newsy z placeholderowymi obrazami (TODO w kodzie).</w:t>
+        <w:t xml:space="preserve">Treść: statyczna w src/data/news.ts — pola { slug, date, title, titlePl, blurb, blurbPl, image?, link?, cta?, ctaPl? }. slug to stałe ID engagementu — NIE zmieniać. Strona główna podstawia wersję PL przed przekazaniem do karuzeli. Pola dodatkowe: story/storyPl (krótki tekst pod IG Stories). Obecnie 4 realne newsy (sesja 4) z grafikami 3:2 w public/images/news/. Surowe grafiki wrzucać do news-inbox/ (gitignored).</w:t>
       </w:r>
     </w:p>
     <w:p>
@@ -4359,10 +4459,10 @@
           <w:b/>
           <w:bCs/>
         </w:rPr>
-        <w:t xml:space="preserve">BUG — logowanie na telefonie (do poprawy): </w:t>
-      </w:r>
-      <w:r>
-        <w:t xml:space="preserve">na telefonie (Safari) nie może odnaleźć serwera. Błąd DNS po stronie przekierowania OAuth, nie kodu. Najpewniejsza przyczyna: Site URL w panelu Supabase ustawiony na http://localhost:3000.</w:t>
+        <w:t xml:space="preserve">Logowanie na telefonie — NAPRAWIONE (sesja 4): </w:t>
+      </w:r>
+      <w:r>
+        <w:t xml:space="preserve">przyczyną był Site URL = localhost w panelu Supabase. Ustawiono przez Chrome: Site URL = https://magic-stories-three.vercel.app, Redirect URLs = produkcja/** + localhost:3000/**. Google OAuth opublikowany (In production).</w:t>
       </w:r>
     </w:p>
     <w:p>
@@ -4374,10 +4474,10 @@
           <w:b/>
           <w:bCs/>
         </w:rPr>
-        <w:t xml:space="preserve">FIX (Supabase → Authentication → URL Configuration): </w:t>
-      </w:r>
-      <w:r>
-        <w:t xml:space="preserve">Site URL → https://magic-stories-three.vercel.app (NIE localhost). Redirect URLs muszą zawierać https://magic-stories-three.vercel.app/** oraz http://localhost:3000/**.</w:t>
+        <w:t xml:space="preserve">Nadawanie rangi Artysta: </w:t>
+      </w:r>
+      <w:r>
+        <w:t xml:space="preserve">snippet "Promote User to Artist (Role Badge)" w SQL Editorze (kopia: supabase/promote_artist.sql). Artysta loguje się na /pl/account, potem update profiles set role='artist', author_slug='&lt;slug&gt;' where username='…'.</w:t>
       </w:r>
     </w:p>
     <w:p>
@@ -4728,7 +4828,7 @@
         <w:spacing w:after="80"/>
       </w:pPr>
       <w:r>
-        <w:t xml:space="preserve">News: grafiki 3:2 ZROBIONE (public/images/news/&lt;slug&gt;.jpg, sesja 4); treść EN+PL bez zmian — ew. szlif słowny. Sprawdzić styk Hero–News na telefonie.</w:t>
+        <w:t xml:space="preserve">News: 4 realne newsy z grafikami 3:2 — GOTOWE. Kolejne newsy: wpis w news.ts (z story/storyPl!) + surowa grafika do news-inbox/. Sprawdzić styk Hero–News na telefonie.</w:t>
       </w:r>
     </w:p>
     <w:p>
@@ -4741,7 +4841,7 @@
         <w:spacing w:after="80"/>
       </w:pPr>
       <w:r>
-        <w:t xml:space="preserve">Magic Library: PRIORYTET: fix logowania na telefonie (Supabase Site URL — pkt 8). FAZA 4 (badge Artysty) — UKOŃCZONA (kotwice, deep-link, supabase/promote_artist.sql; nadanie rangi = SQL w Editorze po pierwszym logowaniu artysty). Dalej: moderacja, paginacja, powiadomienia.</w:t>
+        <w:t xml:space="preserve">Magic Library: logowanie mobilne NAPRAWIONE; FAZA 4 (badge Artysty) — UKOŃCZONA (kotwice, deep-link, supabase/promote_artist.sql; nadanie rangi = SQL w Editorze po pierwszym logowaniu artysty). Dalej: moderacja, paginacja, powiadomienia.</w:t>
       </w:r>
     </w:p>
     <w:p>
@@ -4767,7 +4867,7 @@
         <w:spacing w:after="80"/>
       </w:pPr>
       <w:r>
-        <w:t xml:space="preserve">Produkcja: po pushu sprawdzić /, /pl, /sitemap.xml, /robots.txt, podgląd OG (opengraph.xyz) oraz komentarze. Dodać sitemap w Google Search Console; rozważyć własną domenę. Google OAuth w trybie testing → dodać test users lub opublikować.</w:t>
+        <w:t xml:space="preserve">Produkcja: po pushu sprawdzić /, /pl, /sitemap.xml, /robots.txt, podgląd OG (opengraph.xyz), karuzelę (pełne grafiki) i generator Stories (krótkie teksty). Dodać sitemap w Google Search Console; rozważyć własną domenę. Przetestować pełną ścieżkę: logowanie z telefonu + nadanie rangi Rafa'elowi.</w:t>
       </w:r>
     </w:p>
     <w:p>
@@ -4855,7 +4955,7 @@
         <w:spacing w:after="120"/>
       </w:pPr>
       <w:r>
-        <w:t xml:space="preserve">Najpilniejsze: push + deploy (SEO, badge, grafiki newsów z sesji 4); fix logowania na telefonie (Supabase Site URL); Google Search Console po deployu; brakujące linki Spotify/YouTube/SoundCloud; publikacja Google OAuth.</w:t>
+        <w:t xml:space="preserve">Najpilniejsze: test logowania z telefonu + nadanie rangi Rafa'elowi (link: /pl/account, snippet w SQL Editorze); Google Search Console po deployu; brakujące linki Spotify/YouTube/SoundCloud; pozytywowa wersja logo i stopka.</w:t>
       </w:r>
     </w:p>
     <w:p>

</xml_diff>

<commit_message>
Stories: site fonts + longer text; news: second CTA button, ticket and pre-order links
</commit_message>
<xml_diff>
--- a/MSR_Stan_Projektu_v2026-06-12_MASTER.docx
+++ b/MSR_Stan_Projektu_v2026-06-12_MASTER.docx
@@ -293,6 +293,46 @@
       </w:r>
       <w:r>
         <w:t xml:space="preserve">tytuły zakładek z separatorem | zamiast myślnika (12 szt.); Podcasty: "Każdy mix to nowy rozdział."; nav: /account dodany do darkPages (ciemny pasek); nagłówek sekcji News po angielsku też w PL ("News / Fresh from the label." — decyzja Dave'a, jak Hero).</w:t>
+      </w:r>
+    </w:p>
+    <w:p>
+      <w:pPr>
+        <w:pStyle w:val="ListParagraph"/>
+        <w:numPr>
+          <w:ilvl w:val="0"/>
+          <w:numId w:val="2"/>
+        </w:numPr>
+        <w:spacing w:after="80"/>
+      </w:pPr>
+      <w:r>
+        <w:rPr>
+          <w:b/>
+          <w:bCs/>
+        </w:rPr>
+        <w:t xml:space="preserve">Generator Stories — typografia i pojemność: </w:t>
+      </w:r>
+      <w:r>
+        <w:t xml:space="preserve">canvas używa fontów strony przez cssFontFamily() — czyta realne nazwy rodzin z CSS variables --font-cinzel / --font-inter (next/font rejestruje scoped names, gołe "Cinzel"/"Inter" NIE działają na canvasie) + await document.fonts.ready przed rysowaniem. Opis: 31px / 5 linii przy grafice (35px / 6 bez), interlinia 44/50. Teksty story/storyPl wydłużone do 2-3 zdań.</w:t>
+      </w:r>
+    </w:p>
+    <w:p>
+      <w:pPr>
+        <w:pStyle w:val="ListParagraph"/>
+        <w:numPr>
+          <w:ilvl w:val="0"/>
+          <w:numId w:val="2"/>
+        </w:numPr>
+        <w:spacing w:after="80"/>
+      </w:pPr>
+      <w:r>
+        <w:rPr>
+          <w:b/>
+          <w:bCs/>
+        </w:rPr>
+        <w:t xml:space="preserve">Drugi przycisk w karcie newsa: </w:t>
+      </w:r>
+      <w:r>
+        <w:t xml:space="preserve">nowe pola link2/cta2/cta2Pl w News (renderowane jako drugi liquid-glass button, flex-wrap). KOLORY: bilety → bit.ly/koloryxzielonepatio; Peres: "Pre-order na Beatport" (beatport.com/release/endless-again-oryginal/6984388) + drugi przycisk "Poznaj artystę" → /authors#peres.</w:t>
       </w:r>
     </w:p>
     <w:p>
@@ -4383,7 +4423,7 @@
         <w:spacing w:after="120"/>
       </w:pPr>
       <w:r>
-        <w:t xml:space="preserve">Treść: statyczna w src/data/news.ts — pola { slug, date, title, titlePl, blurb, blurbPl, image?, link?, cta?, ctaPl? }. slug to stałe ID engagementu — NIE zmieniać. Strona główna podstawia wersję PL przed przekazaniem do karuzeli. Pola dodatkowe: story/storyPl (krótki tekst pod IG Stories). Obecnie 4 realne newsy (sesja 4) z grafikami 3:2 w public/images/news/. Surowe grafiki wrzucać do news-inbox/ (gitignored).</w:t>
+        <w:t xml:space="preserve">Treść: statyczna w src/data/news.ts — pola { slug, date, title, titlePl, blurb, blurbPl, image?, link?, cta?, ctaPl? }. slug to stałe ID engagementu — NIE zmieniać. Strona główna podstawia wersję PL przed przekazaniem do karuzeli. Pola dodatkowe: story/storyPl (tekst 2-3 zdania pod IG Stories — OBOWIĄZKOWE przy nowym newsie) oraz link2/cta2/cta2Pl (drugi przycisk). Obecnie 4 realne newsy (sesja 4) z grafikami 3:2 w public/images/news/. Surowe grafiki wrzucać do news-inbox/ (gitignored).</w:t>
       </w:r>
     </w:p>
     <w:p>

</xml_diff>